<commit_message>
Update agent metadata and regenerate inline engineering brief
Replit-Commit-Author: Agent
</commit_message>
<xml_diff>
--- a/vtccp/references/CP-Inline-Engineering-Brief-v1.0.docx
+++ b/vtccp/references/CP-Inline-Engineering-Brief-v1.0.docx
@@ -25,7 +25,7 @@
           <w:color w:val="6B7280"/>
           <w:sz w:val="17"/>
         </w:rPr>
-        <w:t>Prospective project overview for engineering partners     |     Version 1.0  ·  August 2026     |     DRAFT — subject to revision</w:t>
+        <w:t>Prospective project overview for engineering partners     |     Version 1.0  ·  3 August 2026     |     DRAFT — subject to revision</w:t>
       </w:r>
     </w:p>
     <w:p>
@@ -59,7 +59,7 @@
           <w:color w:val="111827"/>
           <w:sz w:val="20"/>
         </w:rPr>
-        <w:t>Command Pilot is a Windows desktop application — built on WPF / .NET 8 — that VCCS/PIPS operates for GS1 DataMatrix barcode print-quality verification on medical device and diagnostic-kit production lines.  Its core job is to receive a scan result from a Cognex DataMan fixed-mount reader, decode the GS1 payload, assess the ISO/IEC 15415 print-quality grade, log the result, and surface it to an operator.  The platform has been in use on label-dispensing / verifier benches and is now being adapted for inline conveyor operation.</w:t>
+        <w:t>Command Pilot is a Windows desktop application — built on WPF / .NET 8 — that VCCS/PIPS operates in its verification laboratory to assess barcode print quality for pharmaceutical, medical device, and other customers.  It accepts scan results from a Cognex DataMan fixed-mount reader, decodes GS1 linear and 2D payloads (and direct-part marks), grades them against ISO/IEC 15415 and related standards, logs each result to Excel and an event log, and presents the outcome to a lab operator.  The application runs on a bench-top verifier station; it is not a production-line application.</w:t>
       </w:r>
     </w:p>
     <w:p>

</xml_diff>

<commit_message>
Update agent metadata and cleanup briefing generation script
Replit-Commit-Author: Agent
</commit_message>
<xml_diff>
--- a/vtccp/references/CP-Inline-Engineering-Brief-v1.0.docx
+++ b/vtccp/references/CP-Inline-Engineering-Brief-v1.0.docx
@@ -86,26 +86,6 @@
           <w:sz w:val="26"/>
         </w:rPr>
         <w:t>2.  Platform architecture (relevant assemblies)</w:t>
-      </w:r>
-    </w:p>
-    <w:p>
-      <w:pPr>
-        <w:pStyle w:val="ListBullet"/>
-        <w:spacing w:after="40"/>
-      </w:pPr>
-      <w:r>
-        <w:rPr>
-          <w:b/>
-          <w:color w:val="1E3A5F"/>
-          <w:sz w:val="20"/>
-        </w:rPr>
-        <w:t xml:space="preserve">DeviceInterface — </w:t>
-      </w:r>
-      <w:r>
-        <w:rPr>
-          <w:color w:val="1E3A5F"/>
-          <w:sz w:val="20"/>
-        </w:rPr>
       </w:r>
     </w:p>
     <w:p>

</xml_diff>

<commit_message>
Update inline engineering brief and generator tool.
Replit-Commit-Author: Agent
</commit_message>
<xml_diff>
--- a/vtccp/references/CP-Inline-Engineering-Brief-v1.0.docx
+++ b/vtccp/references/CP-Inline-Engineering-Brief-v1.0.docx
@@ -148,7 +148,7 @@
           <w:color w:val="111827"/>
           <w:sz w:val="20"/>
         </w:rPr>
-        <w:t>Operator-configurable parameters (job name, operator ID, pass/fail threshold, etc.) with optional PIN-based lockout for production-floor use.</w:t>
+        <w:t>Operator-configurable parameters managed at multiple security levels. Routine job settings (job name, operator ID, roll number, etc.) are accessible to production operators; grading thresholds and other quality-critical parameters are controlled at a more secure level, separate from day-to-day job configuration.</w:t>
       </w:r>
     </w:p>
     <w:p>
@@ -169,7 +169,7 @@
           <w:color w:val="111827"/>
           <w:sz w:val="20"/>
         </w:rPr>
-        <w:t>Relay-board abstraction layer.  Exposes IRelayBoard (hardware-agnostic), MockRelayBoard (development/test), IndicatorPoleController, and ConveyorInterruptController.  Channel assignments and exact line-control behaviour are TBD Engineering.</w:t>
+        <w:t>Relay-board abstraction layer.  Exposes IRelayBoard (hardware-agnostic), MockRelayBoard (development/test), IndicatorPoleController, and ConveyorInterruptController.  Designed to accommodate indicator pole, pusher-divert, emergency-stop (e-stop), and other output channels as assignments are confirmed by Engineering.  Exact line-control behaviour TBD.</w:t>
       </w:r>
     </w:p>
     <w:p>

</xml_diff>

<commit_message>
Update agent assets and engineering brief generation tools
Replit-Commit-Author: Agent
</commit_message>
<xml_diff>
--- a/vtccp/references/CP-Inline-Engineering-Brief-v1.0.docx
+++ b/vtccp/references/CP-Inline-Engineering-Brief-v1.0.docx
@@ -800,7 +800,7 @@
           <w:color w:val="111827"/>
           <w:sz w:val="20"/>
         </w:rPr>
-        <w:t>Lamp count, colour mapping, steady vs. flash behaviour per grade band.  Current mapping is a working assumption; all thresholds negotiable.</w:t>
+        <w:t>Lamp count, colour mapping, steady vs. flash behaviour per grade band, and audible alarm channel.  Current mapping is a working assumption; all thresholds negotiable.</w:t>
       </w:r>
     </w:p>
     <w:p>
@@ -835,14 +835,14 @@
           <w:color w:val="1E3A5F"/>
           <w:sz w:val="20"/>
         </w:rPr>
-        <w:t xml:space="preserve">Grade threshold: </w:t>
+        <w:t xml:space="preserve">Product recipe / config: </w:t>
       </w:r>
       <w:r>
         <w:rPr>
           <w:color w:val="111827"/>
           <w:sz w:val="20"/>
         </w:rPr>
-        <w:t>Customer's pass/fail grade boundary for this specific product and regulatory context.  Default 1.5 assumed; confirm.</w:t>
+        <w:t>A per-product configuration file (approx. 6 products) is needed, capturing fixed product data (GTIN), grade pass/fail threshold, and line settings specific to that product.  Threshold is not a global setting — it is configurable per product by authorised personnel.</w:t>
       </w:r>
     </w:p>
     <w:p>
@@ -863,7 +863,7 @@
           <w:color w:val="111827"/>
           <w:sz w:val="20"/>
         </w:rPr>
-        <w:t>Which frames to archive (all / fail-only / none), storage path, DMST upload workflow for failures.</w:t>
+        <w:t>Which frames to archive (all / fail-only / none), at what resolution and compression quality, storage path and retention policy, and DMST upload workflow for failures.</w:t>
       </w:r>
     </w:p>
     <w:p>
@@ -905,7 +905,7 @@
           <w:color w:val="6B7280"/>
           <w:sz w:val="16"/>
         </w:rPr>
-        <w:t>This document describes the current working concept.  All line-control behaviours, channel assignments, and grade thresholds are provisional and subject to revision as engineering requirements are confirmed.  Contact: VCCS / Product Identification and Processing Systems, Inc.</w:t>
+        <w:t>This document describes the current working concept.  All line-control behaviours, channel assignments, and grade thresholds are provisional and subject to revision as engineering requirements are confirmed.  Contact: George Wright IV — VCCS / Product Identification and Processing Systems, Inc. — gw4@pips.com</w:t>
       </w:r>
     </w:p>
     <w:sectPr>

</xml_diff>

<commit_message>
Update agent metadata and regenerate CP inline engineering brief
Replit-Commit-Author: Agent
</commit_message>
<xml_diff>
--- a/vtccp/references/CP-Inline-Engineering-Brief-v1.0.docx
+++ b/vtccp/references/CP-Inline-Engineering-Brief-v1.0.docx
@@ -170,6 +170,27 @@
           <w:sz w:val="20"/>
         </w:rPr>
         <w:t>Relay-board abstraction layer.  Exposes IRelayBoard (hardware-agnostic), MockRelayBoard (development/test), IndicatorPoleController, and ConveyorInterruptController.  Designed to accommodate indicator pole, pusher-divert, emergency-stop (e-stop), and other output channels as assignments are confirmed by Engineering.  Exact line-control behaviour TBD.</w:t>
+      </w:r>
+    </w:p>
+    <w:p>
+      <w:pPr>
+        <w:pStyle w:val="ListBullet"/>
+        <w:spacing w:after="60"/>
+      </w:pPr>
+      <w:r>
+        <w:rPr>
+          <w:b/>
+          <w:color w:val="1E3A5F"/>
+          <w:sz w:val="20"/>
+        </w:rPr>
+        <w:t xml:space="preserve">ReportEngine — </w:t>
+      </w:r>
+      <w:r>
+        <w:rPr>
+          <w:color w:val="111827"/>
+          <w:sz w:val="20"/>
+        </w:rPr>
+        <w:t>Individual scan result reports can be printed or exported on demand — during production or at any time thereafter — from the session record.  Supported formats include Cognex DataMan, Webscan TruCheck, and hybrid configurations.</w:t>
       </w:r>
     </w:p>
     <w:p>
@@ -863,7 +884,7 @@
           <w:color w:val="111827"/>
           <w:sz w:val="20"/>
         </w:rPr>
-        <w:t>Which frames to archive (all / fail-only / none), at what resolution and compression quality, storage path and retention policy, and DMST upload workflow for failures.</w:t>
+        <w:t>Which frames to archive (all / fail-only / none) and at what resolution and compression quality.  Both JPEG image and raw XML result file should be considered together — the XML carries the complete verifier measurement record and enables report regeneration at any time.  Also: whether to capture the full frame (vs. barcode crop only) for bona fide ISO/IEC regrading and offline analysis.  Storage path, retention policy, and DMST upload workflow for failures also TBD.</w:t>
       </w:r>
     </w:p>
     <w:p>

</xml_diff>

<commit_message>
Update CP inline engineering brief document and generation tool metadata.
Replit-Commit-Author: Agent
</commit_message>
<xml_diff>
--- a/vtccp/references/CP-Inline-Engineering-Brief-v1.0.docx
+++ b/vtccp/references/CP-Inline-Engineering-Brief-v1.0.docx
@@ -516,7 +516,7 @@
               <w:rPr>
                 <w:sz w:val="18"/>
               </w:rPr>
-              <w:t>ConfigEngine (operator config, PIN lock)</w:t>
+              <w:t>ReportEngine (individual scan reports, print/export)</w:t>
             </w:r>
           </w:p>
         </w:tc>
@@ -530,6 +530,50 @@
               <w:rPr>
                 <w:sz w:val="18"/>
               </w:rPr>
+              <w:t>Reuse / extend</w:t>
+            </w:r>
+          </w:p>
+        </w:tc>
+        <w:tc>
+          <w:tcPr>
+            <w:tcW w:type="dxa" w:w="3120"/>
+            <w:shd w:val="clear" w:color="auto" w:fill="EBF4F4"/>
+          </w:tcPr>
+          <w:p>
+            <w:r>
+              <w:rPr>
+                <w:sz w:val="18"/>
+              </w:rPr>
+              <w:t>Medium</w:t>
+            </w:r>
+          </w:p>
+        </w:tc>
+      </w:tr>
+      <w:tr>
+        <w:tc>
+          <w:tcPr>
+            <w:tcW w:type="dxa" w:w="3120"/>
+            <w:shd w:val="clear" w:color="auto" w:fill="FFFFFF"/>
+          </w:tcPr>
+          <w:p>
+            <w:r>
+              <w:rPr>
+                <w:sz w:val="18"/>
+              </w:rPr>
+              <w:t>ConfigEngine (operator config, PIN lock)</w:t>
+            </w:r>
+          </w:p>
+        </w:tc>
+        <w:tc>
+          <w:tcPr>
+            <w:tcW w:type="dxa" w:w="3120"/>
+            <w:shd w:val="clear" w:color="auto" w:fill="FFFFFF"/>
+          </w:tcPr>
+          <w:p>
+            <w:r>
+              <w:rPr>
+                <w:sz w:val="18"/>
+              </w:rPr>
               <w:t>Reuse as-is</w:t>
             </w:r>
           </w:p>
@@ -537,7 +581,7 @@
         <w:tc>
           <w:tcPr>
             <w:tcW w:type="dxa" w:w="3120"/>
-            <w:shd w:val="clear" w:color="auto" w:fill="EBF4F4"/>
+            <w:shd w:val="clear" w:color="auto" w:fill="FFFFFF"/>
           </w:tcPr>
           <w:p>
             <w:r>
@@ -553,7 +597,7 @@
         <w:tc>
           <w:tcPr>
             <w:tcW w:type="dxa" w:w="3120"/>
-            <w:shd w:val="clear" w:color="auto" w:fill="FFFFFF"/>
+            <w:shd w:val="clear" w:color="auto" w:fill="EBF4F4"/>
           </w:tcPr>
           <w:p>
             <w:r>
@@ -567,6 +611,36 @@
         <w:tc>
           <w:tcPr>
             <w:tcW w:type="dxa" w:w="3120"/>
+            <w:shd w:val="clear" w:color="auto" w:fill="EBF4F4"/>
+          </w:tcPr>
+          <w:p>
+            <w:r>
+              <w:rPr>
+                <w:sz w:val="18"/>
+              </w:rPr>
+              <w:t>New — stub complete</w:t>
+            </w:r>
+          </w:p>
+        </w:tc>
+        <w:tc>
+          <w:tcPr>
+            <w:tcW w:type="dxa" w:w="3120"/>
+            <w:shd w:val="clear" w:color="auto" w:fill="EBF4F4"/>
+          </w:tcPr>
+          <w:p>
+            <w:r>
+              <w:rPr>
+                <w:sz w:val="18"/>
+              </w:rPr>
+              <w:t>—</w:t>
+            </w:r>
+          </w:p>
+        </w:tc>
+      </w:tr>
+      <w:tr>
+        <w:tc>
+          <w:tcPr>
+            <w:tcW w:type="dxa" w:w="3120"/>
             <w:shd w:val="clear" w:color="auto" w:fill="FFFFFF"/>
           </w:tcPr>
           <w:p>
@@ -574,7 +648,21 @@
               <w:rPr>
                 <w:sz w:val="18"/>
               </w:rPr>
-              <w:t>New — stub complete</w:t>
+              <w:t>Command Pilot Inline Operator Panel (WPF)</w:t>
+            </w:r>
+          </w:p>
+        </w:tc>
+        <w:tc>
+          <w:tcPr>
+            <w:tcW w:type="dxa" w:w="3120"/>
+            <w:shd w:val="clear" w:color="auto" w:fill="FFFFFF"/>
+          </w:tcPr>
+          <w:p>
+            <w:r>
+              <w:rPr>
+                <w:sz w:val="18"/>
+              </w:rPr>
+              <w:t>New build</w:t>
             </w:r>
           </w:p>
         </w:tc>
@@ -604,7 +692,7 @@
               <w:rPr>
                 <w:sz w:val="18"/>
               </w:rPr>
-              <w:t>Command Pilot Inline Operator Panel (WPF)</w:t>
+              <w:t>Line-control integration (divert, stop, etc.)</w:t>
             </w:r>
           </w:p>
         </w:tc>
@@ -618,7 +706,7 @@
               <w:rPr>
                 <w:sz w:val="18"/>
               </w:rPr>
-              <w:t>New build</w:t>
+              <w:t>TBD Engineering</w:t>
             </w:r>
           </w:p>
         </w:tc>
@@ -648,7 +736,7 @@
               <w:rPr>
                 <w:sz w:val="18"/>
               </w:rPr>
-              <w:t>Line-control integration (divert, stop, etc.)</w:t>
+              <w:t>Relay board hardware + wiring</w:t>
             </w:r>
           </w:p>
         </w:tc>
@@ -670,50 +758,6 @@
           <w:tcPr>
             <w:tcW w:type="dxa" w:w="3120"/>
             <w:shd w:val="clear" w:color="auto" w:fill="FFFFFF"/>
-          </w:tcPr>
-          <w:p>
-            <w:r>
-              <w:rPr>
-                <w:sz w:val="18"/>
-              </w:rPr>
-              <w:t>—</w:t>
-            </w:r>
-          </w:p>
-        </w:tc>
-      </w:tr>
-      <w:tr>
-        <w:tc>
-          <w:tcPr>
-            <w:tcW w:type="dxa" w:w="3120"/>
-            <w:shd w:val="clear" w:color="auto" w:fill="EBF4F4"/>
-          </w:tcPr>
-          <w:p>
-            <w:r>
-              <w:rPr>
-                <w:sz w:val="18"/>
-              </w:rPr>
-              <w:t>Relay board hardware + wiring</w:t>
-            </w:r>
-          </w:p>
-        </w:tc>
-        <w:tc>
-          <w:tcPr>
-            <w:tcW w:type="dxa" w:w="3120"/>
-            <w:shd w:val="clear" w:color="auto" w:fill="EBF4F4"/>
-          </w:tcPr>
-          <w:p>
-            <w:r>
-              <w:rPr>
-                <w:sz w:val="18"/>
-              </w:rPr>
-              <w:t>TBD Engineering</w:t>
-            </w:r>
-          </w:p>
-        </w:tc>
-        <w:tc>
-          <w:tcPr>
-            <w:tcW w:type="dxa" w:w="3120"/>
-            <w:shd w:val="clear" w:color="auto" w:fill="EBF4F4"/>
           </w:tcPr>
           <w:p>
             <w:r>

</xml_diff>